<commit_message>
chore: update daily inspection documents for consistency
</commit_message>
<xml_diff>
--- a/storage/app/templates/Loader daily.docx
+++ b/storage/app/templates/Loader daily.docx
@@ -899,6 +899,7 @@
           <w:insideH w:val="single" w:sz="8" w:space="0" w:color="auto"/>
           <w:insideV w:val="single" w:sz="8" w:space="0" w:color="auto"/>
         </w:tblBorders>
+        <w:tblLayout w:type="fixed"/>
         <w:tblLook w:val="0000" w:firstRow="0" w:lastRow="0" w:firstColumn="0" w:lastColumn="0" w:noHBand="0" w:noVBand="0"/>
       </w:tblPr>
       <w:tblGrid>
@@ -1434,17 +1435,7 @@
                 <w:sz w:val="18"/>
                 <w:szCs w:val="18"/>
               </w:rPr>
-              <w:t>mark (√) if Check is positive and (</w:t>
-            </w:r>
-            <w:proofErr w:type="gramStart"/>
-            <w:r>
-              <w:rPr>
-                <w:b/>
-                <w:bCs/>
-                <w:sz w:val="18"/>
-                <w:szCs w:val="18"/>
-              </w:rPr>
-              <w:t>×)</w:t>
+              <w:t>mark (√) if Check is positive and (×)</w:t>
             </w:r>
             <w:r>
               <w:rPr>
@@ -1464,17 +1455,7 @@
                 <w:sz w:val="18"/>
                 <w:szCs w:val="18"/>
               </w:rPr>
-              <w:t xml:space="preserve"> if</w:t>
-            </w:r>
-            <w:proofErr w:type="gramEnd"/>
-            <w:r>
-              <w:rPr>
-                <w:b/>
-                <w:bCs/>
-                <w:sz w:val="18"/>
-                <w:szCs w:val="18"/>
-              </w:rPr>
-              <w:t xml:space="preserve"> Check is negative</w:t>
+              <w:t xml:space="preserve"> if Check is negative</w:t>
             </w:r>
           </w:p>
         </w:tc>

</xml_diff>